<commit_message>
Tighten report metadata and setup section
</commit_message>
<xml_diff>
--- a/report/report.docx
+++ b/report/report.docx
@@ -18,40 +18,6 @@
         <w:t xml:space="preserve">Raju Kanumuri (vk2646)</w:t>
       </w:r>
     </w:p>
-    <w:p>
-      <w:pPr>
-        <w:pStyle w:val="Date"/>
-      </w:pPr>
-      <w:r>
-        <w:t xml:space="preserve">April 15, 2026</w:t>
-      </w:r>
-    </w:p>
-    <w:sdt>
-      <w:sdtPr>
-        <w:docPartObj>
-          <w:docPartGallery w:val="Table of Contents"/>
-          <w:docPartUnique/>
-        </w:docPartObj>
-      </w:sdtPr>
-      <w:sdtContent>
-        <w:p>
-          <w:pPr>
-            <w:pStyle w:val="TOCHeading"/>
-          </w:pPr>
-          <w:r>
-            <w:t xml:space="preserve">Table of Contents</w:t>
-          </w:r>
-        </w:p>
-        <w:p>
-          <w:r>
-            <w:fldChar w:fldCharType="begin" w:dirty="true"/>
-            <w:instrText xml:space="preserve">TOC \o "1-2" \h \z \u</w:instrText>
-            <w:fldChar w:fldCharType="separate"/>
-            <w:fldChar w:fldCharType="end"/>
-          </w:r>
-        </w:p>
-      </w:sdtContent>
-    </w:sdt>
     <w:bookmarkStart w:id="20" w:name="abstract"/>
     <w:p>
       <w:pPr>
@@ -847,7 +813,7 @@
         <w:pStyle w:val="BodyText"/>
       </w:pPr>
       <w:r>
-        <w:t xml:space="preserve">The repository contains several tools:</w:t>
+        <w:t xml:space="preserve">The final submission contains two main executables:</w:t>
       </w:r>
     </w:p>
     <w:p>
@@ -868,7 +834,7 @@
         <w:t xml:space="preserve"> </w:t>
       </w:r>
       <w:r>
-        <w:t xml:space="preserve">for correctness and concurrency regression testing</w:t>
+        <w:t xml:space="preserve">for correctness and concurrency testing</w:t>
       </w:r>
     </w:p>
     <w:p>
@@ -889,106 +855,15 @@
         <w:t xml:space="preserve"> </w:t>
       </w:r>
       <w:r>
-        <w:t xml:space="preserve">for a broad side-by-side throughput comparison</w:t>
-      </w:r>
-    </w:p>
-    <w:p>
-      <w:pPr>
-        <w:pStyle w:val="Compact"/>
-        <w:numPr>
-          <w:ilvl w:val="0"/>
-          <w:numId w:val="1002"/>
-        </w:numPr>
-      </w:pPr>
-      <w:r>
-        <w:rPr>
-          <w:rStyle w:val="VerbatimChar"/>
-        </w:rPr>
-        <w:t xml:space="preserve">profile_runner</w:t>
-      </w:r>
-      <w:r>
-        <w:t xml:space="preserve"> </w:t>
-      </w:r>
-      <w:r>
-        <w:t xml:space="preserve">for software-level profiling of the lock-free</w:t>
-      </w:r>
-      <w:r>
-        <w:t xml:space="preserve"> </w:t>
-      </w:r>
-      <w:r>
-        <w:rPr>
-          <w:rStyle w:val="VerbatimChar"/>
-        </w:rPr>
-        <w:t xml:space="preserve">put()</w:t>
-      </w:r>
-      <w:r>
-        <w:t xml:space="preserve"> </w:t>
-      </w:r>
-      <w:r>
-        <w:t xml:space="preserve">path</w:t>
-      </w:r>
-    </w:p>
-    <w:p>
-      <w:pPr>
-        <w:pStyle w:val="Compact"/>
-        <w:numPr>
-          <w:ilvl w:val="0"/>
-          <w:numId w:val="1002"/>
-        </w:numPr>
-      </w:pPr>
-      <w:r>
-        <w:rPr>
-          <w:rStyle w:val="VerbatimChar"/>
-        </w:rPr>
-        <w:t xml:space="preserve">bucket_sweep</w:t>
-      </w:r>
-      <w:r>
-        <w:t xml:space="preserve"> </w:t>
-      </w:r>
-      <w:r>
-        <w:t xml:space="preserve">for evaluating the effect of bucket count and load</w:t>
-      </w:r>
-    </w:p>
-    <w:p>
-      <w:pPr>
-        <w:pStyle w:val="Compact"/>
-        <w:numPr>
-          <w:ilvl w:val="0"/>
-          <w:numId w:val="1002"/>
-        </w:numPr>
-      </w:pPr>
-      <w:r>
-        <w:rPr>
-          <w:rStyle w:val="VerbatimChar"/>
-        </w:rPr>
-        <w:t xml:space="preserve">scripts/variant_sweep.py</w:t>
-      </w:r>
-      <w:r>
-        <w:t xml:space="preserve"> </w:t>
-      </w:r>
-      <w:r>
-        <w:t xml:space="preserve">for a structured cross-branch benchmark sweep</w:t>
-      </w:r>
-    </w:p>
-    <w:p>
-      <w:pPr>
-        <w:pStyle w:val="Compact"/>
-        <w:numPr>
-          <w:ilvl w:val="0"/>
-          <w:numId w:val="1002"/>
-        </w:numPr>
-      </w:pPr>
-      <w:r>
-        <w:rPr>
-          <w:rStyle w:val="VerbatimChar"/>
-        </w:rPr>
-        <w:t xml:space="preserve">scripts/extended_experiments.py</w:t>
-      </w:r>
-      <w:r>
-        <w:t xml:space="preserve"> </w:t>
-      </w:r>
-      <w:r>
-        <w:t xml:space="preserve">for workload-mix, contention, and resize-focused experiments</w:t>
+        <w:t xml:space="preserve">for side-by-side throughput comparison across the four implementations</w:t>
+      </w:r>
+    </w:p>
+    <w:p>
+      <w:pPr>
+        <w:pStyle w:val="FirstParagraph"/>
+      </w:pPr>
+      <w:r>
+        <w:t xml:space="preserve">During development, additional internal sweep scripts were used to generate the broader experiment tables and figures discussed in this report. Those scripts were only used to produce the results; the final submission keeps the code and commands needed for building, testing, and benchmarking on the target machine.</w:t>
       </w:r>
     </w:p>
     <w:bookmarkStart w:id="37" w:name="core-cross-variant-sweep"/>
@@ -1238,45 +1113,7 @@
         <w:t xml:space="preserve">MIXED</w:t>
       </w:r>
       <w:r>
-        <w:t xml:space="preserve">, the key space was preloaded and the operation count was derived from that key space. The resulting CSV files are:</w:t>
-      </w:r>
-    </w:p>
-    <w:p>
-      <w:pPr>
-        <w:pStyle w:val="Compact"/>
-        <w:numPr>
-          <w:ilvl w:val="0"/>
-          <w:numId w:val="1004"/>
-        </w:numPr>
-      </w:pPr>
-      <w:r>
-        <w:rPr>
-          <w:rStyle w:val="VerbatimChar"/>
-        </w:rPr>
-        <w:t xml:space="preserve">results/variant_sweep_raw.csv</w:t>
-      </w:r>
-    </w:p>
-    <w:p>
-      <w:pPr>
-        <w:pStyle w:val="Compact"/>
-        <w:numPr>
-          <w:ilvl w:val="0"/>
-          <w:numId w:val="1004"/>
-        </w:numPr>
-      </w:pPr>
-      <w:r>
-        <w:rPr>
-          <w:rStyle w:val="VerbatimChar"/>
-        </w:rPr>
-        <w:t xml:space="preserve">results/variant_sweep_summary.csv</w:t>
-      </w:r>
-    </w:p>
-    <w:p>
-      <w:pPr>
-        <w:pStyle w:val="FirstParagraph"/>
-      </w:pPr>
-      <w:r>
-        <w:t xml:space="preserve">The summary file reports median, mean, best runtime, and median throughput in million operations per second.</w:t>
+        <w:t xml:space="preserve">, the key space was preloaded and the operation count was derived from that key space. The final comparison uses aggregated runtimes across repeated runs so that the conclusions are not based on one noisy measurement.</w:t>
       </w:r>
     </w:p>
     <w:bookmarkEnd w:id="37"/>
@@ -1322,7 +1159,7 @@
         <w:pStyle w:val="Compact"/>
         <w:numPr>
           <w:ilvl w:val="0"/>
-          <w:numId w:val="1005"/>
+          <w:numId w:val="1004"/>
         </w:numPr>
       </w:pPr>
       <w:r>
@@ -1355,7 +1192,7 @@
         <w:pStyle w:val="Compact"/>
         <w:numPr>
           <w:ilvl w:val="0"/>
-          <w:numId w:val="1005"/>
+          <w:numId w:val="1004"/>
         </w:numPr>
       </w:pPr>
       <w:r>
@@ -1400,7 +1237,7 @@
         <w:pStyle w:val="Compact"/>
         <w:numPr>
           <w:ilvl w:val="0"/>
-          <w:numId w:val="1005"/>
+          <w:numId w:val="1004"/>
         </w:numPr>
       </w:pPr>
       <w:r>
@@ -1473,7 +1310,7 @@
         <w:pStyle w:val="Compact"/>
         <w:numPr>
           <w:ilvl w:val="0"/>
-          <w:numId w:val="1006"/>
+          <w:numId w:val="1005"/>
         </w:numPr>
       </w:pPr>
       <w:r>
@@ -1488,7 +1325,7 @@
         <w:pStyle w:val="Compact"/>
         <w:numPr>
           <w:ilvl w:val="0"/>
-          <w:numId w:val="1006"/>
+          <w:numId w:val="1005"/>
         </w:numPr>
       </w:pPr>
       <w:r>
@@ -1503,7 +1340,7 @@
         <w:pStyle w:val="Compact"/>
         <w:numPr>
           <w:ilvl w:val="0"/>
-          <w:numId w:val="1006"/>
+          <w:numId w:val="1005"/>
         </w:numPr>
       </w:pPr>
       <w:r>
@@ -1518,7 +1355,7 @@
         <w:pStyle w:val="Compact"/>
         <w:numPr>
           <w:ilvl w:val="0"/>
-          <w:numId w:val="1006"/>
+          <w:numId w:val="1005"/>
         </w:numPr>
       </w:pPr>
       <w:r>
@@ -1561,7 +1398,7 @@
         <w:pStyle w:val="Compact"/>
         <w:numPr>
           <w:ilvl w:val="0"/>
-          <w:numId w:val="1007"/>
+          <w:numId w:val="1006"/>
         </w:numPr>
       </w:pPr>
       <w:r>
@@ -1576,7 +1413,7 @@
         <w:pStyle w:val="Compact"/>
         <w:numPr>
           <w:ilvl w:val="0"/>
-          <w:numId w:val="1007"/>
+          <w:numId w:val="1006"/>
         </w:numPr>
       </w:pPr>
       <w:r>
@@ -1591,7 +1428,7 @@
         <w:pStyle w:val="Compact"/>
         <w:numPr>
           <w:ilvl w:val="0"/>
-          <w:numId w:val="1007"/>
+          <w:numId w:val="1006"/>
         </w:numPr>
       </w:pPr>
       <w:r>
@@ -1614,52 +1451,7 @@
         <w:pStyle w:val="BodyText"/>
       </w:pPr>
       <w:r>
-        <w:t xml:space="preserve">These focused experiments produced:</w:t>
-      </w:r>
-    </w:p>
-    <w:p>
-      <w:pPr>
-        <w:pStyle w:val="Compact"/>
-        <w:numPr>
-          <w:ilvl w:val="0"/>
-          <w:numId w:val="1008"/>
-        </w:numPr>
-      </w:pPr>
-      <w:r>
-        <w:rPr>
-          <w:rStyle w:val="VerbatimChar"/>
-        </w:rPr>
-        <w:t xml:space="preserve">results/workload_mix_summary.csv</w:t>
-      </w:r>
-    </w:p>
-    <w:p>
-      <w:pPr>
-        <w:pStyle w:val="Compact"/>
-        <w:numPr>
-          <w:ilvl w:val="0"/>
-          <w:numId w:val="1008"/>
-        </w:numPr>
-      </w:pPr>
-      <w:r>
-        <w:rPr>
-          <w:rStyle w:val="VerbatimChar"/>
-        </w:rPr>
-        <w:t xml:space="preserve">results/contention_sweep_summary.csv</w:t>
-      </w:r>
-    </w:p>
-    <w:p>
-      <w:pPr>
-        <w:pStyle w:val="Compact"/>
-        <w:numPr>
-          <w:ilvl w:val="0"/>
-          <w:numId w:val="1008"/>
-        </w:numPr>
-      </w:pPr>
-      <w:r>
-        <w:rPr>
-          <w:rStyle w:val="VerbatimChar"/>
-        </w:rPr>
-        <w:t xml:space="preserve">results/resize_focus_summary.csv</w:t>
+        <w:t xml:space="preserve">These focused experiments were summarized into the tables and figures used in the Results section.</w:t>
       </w:r>
     </w:p>
     <w:bookmarkEnd w:id="38"/>
@@ -1685,7 +1477,7 @@
         <w:pStyle w:val="Compact"/>
         <w:numPr>
           <w:ilvl w:val="0"/>
-          <w:numId w:val="1009"/>
+          <w:numId w:val="1007"/>
         </w:numPr>
       </w:pPr>
       <w:r>
@@ -1697,7 +1489,7 @@
         <w:pStyle w:val="Compact"/>
         <w:numPr>
           <w:ilvl w:val="0"/>
-          <w:numId w:val="1009"/>
+          <w:numId w:val="1007"/>
         </w:numPr>
       </w:pPr>
       <w:r>
@@ -1709,7 +1501,7 @@
         <w:pStyle w:val="Compact"/>
         <w:numPr>
           <w:ilvl w:val="0"/>
-          <w:numId w:val="1009"/>
+          <w:numId w:val="1007"/>
         </w:numPr>
       </w:pPr>
       <w:r>
@@ -1721,7 +1513,7 @@
         <w:pStyle w:val="Compact"/>
         <w:numPr>
           <w:ilvl w:val="0"/>
-          <w:numId w:val="1009"/>
+          <w:numId w:val="1007"/>
         </w:numPr>
       </w:pPr>
       <w:r>
@@ -1733,7 +1525,7 @@
         <w:pStyle w:val="Compact"/>
         <w:numPr>
           <w:ilvl w:val="0"/>
-          <w:numId w:val="1009"/>
+          <w:numId w:val="1007"/>
         </w:numPr>
       </w:pPr>
       <w:r>
@@ -1745,7 +1537,7 @@
         <w:pStyle w:val="Compact"/>
         <w:numPr>
           <w:ilvl w:val="0"/>
-          <w:numId w:val="1009"/>
+          <w:numId w:val="1007"/>
         </w:numPr>
       </w:pPr>
       <w:r>
@@ -1757,7 +1549,7 @@
         <w:pStyle w:val="Compact"/>
         <w:numPr>
           <w:ilvl w:val="0"/>
-          <w:numId w:val="1009"/>
+          <w:numId w:val="1007"/>
         </w:numPr>
       </w:pPr>
       <w:r>
@@ -1952,7 +1744,7 @@
         <w:pStyle w:val="Compact"/>
         <w:numPr>
           <w:ilvl w:val="0"/>
-          <w:numId w:val="1010"/>
+          <w:numId w:val="1008"/>
         </w:numPr>
       </w:pPr>
       <w:r>
@@ -1973,7 +1765,7 @@
         <w:pStyle w:val="Compact"/>
         <w:numPr>
           <w:ilvl w:val="0"/>
-          <w:numId w:val="1010"/>
+          <w:numId w:val="1008"/>
         </w:numPr>
       </w:pPr>
       <w:r>
@@ -1994,7 +1786,7 @@
         <w:pStyle w:val="Compact"/>
         <w:numPr>
           <w:ilvl w:val="0"/>
-          <w:numId w:val="1010"/>
+          <w:numId w:val="1008"/>
         </w:numPr>
       </w:pPr>
       <w:r>
@@ -2015,7 +1807,7 @@
         <w:pStyle w:val="Compact"/>
         <w:numPr>
           <w:ilvl w:val="0"/>
-          <w:numId w:val="1010"/>
+          <w:numId w:val="1008"/>
         </w:numPr>
       </w:pPr>
       <w:r>
@@ -2235,7 +2027,7 @@
         <w:pStyle w:val="Compact"/>
         <w:numPr>
           <w:ilvl w:val="0"/>
-          <w:numId w:val="1011"/>
+          <w:numId w:val="1009"/>
         </w:numPr>
       </w:pPr>
       <w:r>
@@ -2256,7 +2048,7 @@
         <w:pStyle w:val="Compact"/>
         <w:numPr>
           <w:ilvl w:val="0"/>
-          <w:numId w:val="1011"/>
+          <w:numId w:val="1009"/>
         </w:numPr>
       </w:pPr>
       <w:r>
@@ -2277,7 +2069,7 @@
         <w:pStyle w:val="Compact"/>
         <w:numPr>
           <w:ilvl w:val="0"/>
-          <w:numId w:val="1011"/>
+          <w:numId w:val="1009"/>
         </w:numPr>
       </w:pPr>
       <w:r>
@@ -2298,7 +2090,7 @@
         <w:pStyle w:val="Compact"/>
         <w:numPr>
           <w:ilvl w:val="0"/>
-          <w:numId w:val="1011"/>
+          <w:numId w:val="1009"/>
         </w:numPr>
       </w:pPr>
       <w:r>
@@ -2496,7 +2288,7 @@
         <w:pStyle w:val="Compact"/>
         <w:numPr>
           <w:ilvl w:val="0"/>
-          <w:numId w:val="1012"/>
+          <w:numId w:val="1010"/>
         </w:numPr>
       </w:pPr>
       <w:r>
@@ -2517,7 +2309,7 @@
         <w:pStyle w:val="Compact"/>
         <w:numPr>
           <w:ilvl w:val="0"/>
-          <w:numId w:val="1012"/>
+          <w:numId w:val="1010"/>
         </w:numPr>
       </w:pPr>
       <w:r>
@@ -2538,7 +2330,7 @@
         <w:pStyle w:val="Compact"/>
         <w:numPr>
           <w:ilvl w:val="0"/>
-          <w:numId w:val="1012"/>
+          <w:numId w:val="1010"/>
         </w:numPr>
       </w:pPr>
       <w:r>
@@ -2559,7 +2351,7 @@
         <w:pStyle w:val="Compact"/>
         <w:numPr>
           <w:ilvl w:val="0"/>
-          <w:numId w:val="1012"/>
+          <w:numId w:val="1010"/>
         </w:numPr>
       </w:pPr>
       <w:r>
@@ -2726,10 +2518,253 @@
         <w:pStyle w:val="Compact"/>
         <w:numPr>
           <w:ilvl w:val="0"/>
+          <w:numId w:val="1011"/>
+        </w:numPr>
+      </w:pPr>
+      <w:r>
+        <w:t xml:space="preserve">fixed-size lock-free chaining:</w:t>
+      </w:r>
+      <w:r>
+        <w:t xml:space="preserve"> </w:t>
+      </w:r>
+      <w:r>
+        <w:rPr>
+          <w:rStyle w:val="VerbatimChar"/>
+        </w:rPr>
+        <w:t xml:space="preserve">2.855 ms</w:t>
+      </w:r>
+    </w:p>
+    <w:p>
+      <w:pPr>
+        <w:pStyle w:val="Compact"/>
+        <w:numPr>
+          <w:ilvl w:val="0"/>
+          <w:numId w:val="1011"/>
+        </w:numPr>
+      </w:pPr>
+      <w:r>
+        <w:t xml:space="preserve">lock-free dynamic resize:</w:t>
+      </w:r>
+      <w:r>
+        <w:t xml:space="preserve"> </w:t>
+      </w:r>
+      <w:r>
+        <w:rPr>
+          <w:rStyle w:val="VerbatimChar"/>
+        </w:rPr>
+        <w:t xml:space="preserve">2.904 ms</w:t>
+      </w:r>
+    </w:p>
+    <w:p>
+      <w:pPr>
+        <w:pStyle w:val="Compact"/>
+        <w:numPr>
+          <w:ilvl w:val="0"/>
+          <w:numId w:val="1011"/>
+        </w:numPr>
+      </w:pPr>
+      <w:r>
+        <w:t xml:space="preserve">lock-based dynamic:</w:t>
+      </w:r>
+      <w:r>
+        <w:t xml:space="preserve"> </w:t>
+      </w:r>
+      <w:r>
+        <w:rPr>
+          <w:rStyle w:val="VerbatimChar"/>
+        </w:rPr>
+        <w:t xml:space="preserve">113.080 ms</w:t>
+      </w:r>
+    </w:p>
+    <w:p>
+      <w:pPr>
+        <w:pStyle w:val="Compact"/>
+        <w:numPr>
+          <w:ilvl w:val="0"/>
+          <w:numId w:val="1011"/>
+        </w:numPr>
+      </w:pPr>
+      <w:r>
+        <w:t xml:space="preserve">open addressing:</w:t>
+      </w:r>
+      <w:r>
+        <w:t xml:space="preserve"> </w:t>
+      </w:r>
+      <w:r>
+        <w:rPr>
+          <w:rStyle w:val="VerbatimChar"/>
+        </w:rPr>
+        <w:t xml:space="preserve">113.517 ms</w:t>
+      </w:r>
+    </w:p>
+    <w:p>
+      <w:pPr>
+        <w:pStyle w:val="FirstParagraph"/>
+      </w:pPr>
+      <w:r>
+        <w:t xml:space="preserve">This is effectively a tie between the two chaining-based lock-free versions, with the fixed-size version slightly ahead.</w:t>
+      </w:r>
+    </w:p>
+    <w:p>
+      <w:pPr>
+        <w:pStyle w:val="BodyText"/>
+      </w:pPr>
+      <w:r>
+        <w:t xml:space="preserve">For the balanced mix at</w:t>
+      </w:r>
+      <w:r>
+        <w:t xml:space="preserve"> </w:t>
+      </w:r>
+      <w:r>
+        <w:rPr>
+          <w:rStyle w:val="VerbatimChar"/>
+        </w:rPr>
+        <w:t xml:space="preserve">16</w:t>
+      </w:r>
+      <w:r>
+        <w:t xml:space="preserve"> </w:t>
+      </w:r>
+      <w:r>
+        <w:t xml:space="preserve">threads:</w:t>
+      </w:r>
+    </w:p>
+    <w:p>
+      <w:pPr>
+        <w:pStyle w:val="Compact"/>
+        <w:numPr>
+          <w:ilvl w:val="0"/>
+          <w:numId w:val="1012"/>
+        </w:numPr>
+      </w:pPr>
+      <w:r>
+        <w:t xml:space="preserve">fixed-size lock-free chaining:</w:t>
+      </w:r>
+      <w:r>
+        <w:t xml:space="preserve"> </w:t>
+      </w:r>
+      <w:r>
+        <w:rPr>
+          <w:rStyle w:val="VerbatimChar"/>
+        </w:rPr>
+        <w:t xml:space="preserve">11.529 ms</w:t>
+      </w:r>
+    </w:p>
+    <w:p>
+      <w:pPr>
+        <w:pStyle w:val="Compact"/>
+        <w:numPr>
+          <w:ilvl w:val="0"/>
+          <w:numId w:val="1012"/>
+        </w:numPr>
+      </w:pPr>
+      <w:r>
+        <w:t xml:space="preserve">lock-free dynamic resize:</w:t>
+      </w:r>
+      <w:r>
+        <w:t xml:space="preserve"> </w:t>
+      </w:r>
+      <w:r>
+        <w:rPr>
+          <w:rStyle w:val="VerbatimChar"/>
+        </w:rPr>
+        <w:t xml:space="preserve">14.684 ms</w:t>
+      </w:r>
+    </w:p>
+    <w:p>
+      <w:pPr>
+        <w:pStyle w:val="Compact"/>
+        <w:numPr>
+          <w:ilvl w:val="0"/>
+          <w:numId w:val="1012"/>
+        </w:numPr>
+      </w:pPr>
+      <w:r>
+        <w:t xml:space="preserve">lock-based dynamic:</w:t>
+      </w:r>
+      <w:r>
+        <w:t xml:space="preserve"> </w:t>
+      </w:r>
+      <w:r>
+        <w:rPr>
+          <w:rStyle w:val="VerbatimChar"/>
+        </w:rPr>
+        <w:t xml:space="preserve">112.746 ms</w:t>
+      </w:r>
+    </w:p>
+    <w:p>
+      <w:pPr>
+        <w:pStyle w:val="Compact"/>
+        <w:numPr>
+          <w:ilvl w:val="0"/>
+          <w:numId w:val="1012"/>
+        </w:numPr>
+      </w:pPr>
+      <w:r>
+        <w:t xml:space="preserve">open addressing:</w:t>
+      </w:r>
+      <w:r>
+        <w:t xml:space="preserve"> </w:t>
+      </w:r>
+      <w:r>
+        <w:rPr>
+          <w:rStyle w:val="VerbatimChar"/>
+        </w:rPr>
+        <w:t xml:space="preserve">182.475 ms</w:t>
+      </w:r>
+    </w:p>
+    <w:p>
+      <w:pPr>
+        <w:pStyle w:val="FirstParagraph"/>
+      </w:pPr>
+      <w:r>
+        <w:t xml:space="preserve">For the write-heavy mix at</w:t>
+      </w:r>
+      <w:r>
+        <w:t xml:space="preserve"> </w:t>
+      </w:r>
+      <w:r>
+        <w:rPr>
+          <w:rStyle w:val="VerbatimChar"/>
+        </w:rPr>
+        <w:t xml:space="preserve">16</w:t>
+      </w:r>
+      <w:r>
+        <w:t xml:space="preserve"> </w:t>
+      </w:r>
+      <w:r>
+        <w:t xml:space="preserve">threads:</w:t>
+      </w:r>
+    </w:p>
+    <w:p>
+      <w:pPr>
+        <w:pStyle w:val="Compact"/>
+        <w:numPr>
+          <w:ilvl w:val="0"/>
           <w:numId w:val="1013"/>
         </w:numPr>
       </w:pPr>
       <w:r>
+        <w:t xml:space="preserve">lock-free dynamic resize:</w:t>
+      </w:r>
+      <w:r>
+        <w:t xml:space="preserve"> </w:t>
+      </w:r>
+      <w:r>
+        <w:rPr>
+          <w:rStyle w:val="VerbatimChar"/>
+        </w:rPr>
+        <w:t xml:space="preserve">27.564 ms</w:t>
+      </w:r>
+    </w:p>
+    <w:p>
+      <w:pPr>
+        <w:pStyle w:val="Compact"/>
+        <w:numPr>
+          <w:ilvl w:val="0"/>
+          <w:numId w:val="1013"/>
+        </w:numPr>
+      </w:pPr>
+      <w:r>
         <w:t xml:space="preserve">fixed-size lock-free chaining:</w:t>
       </w:r>
       <w:r>
@@ -2739,7 +2774,7 @@
         <w:rPr>
           <w:rStyle w:val="VerbatimChar"/>
         </w:rPr>
-        <w:t xml:space="preserve">2.855 ms</w:t>
+        <w:t xml:space="preserve">31.085 ms</w:t>
       </w:r>
     </w:p>
     <w:p>
@@ -2751,16 +2786,16 @@
         </w:numPr>
       </w:pPr>
       <w:r>
-        <w:t xml:space="preserve">lock-free dynamic resize:</w:t>
-      </w:r>
-      <w:r>
-        <w:t xml:space="preserve"> </w:t>
-      </w:r>
-      <w:r>
-        <w:rPr>
-          <w:rStyle w:val="VerbatimChar"/>
-        </w:rPr>
-        <w:t xml:space="preserve">2.904 ms</w:t>
+        <w:t xml:space="preserve">lock-based dynamic:</w:t>
+      </w:r>
+      <w:r>
+        <w:t xml:space="preserve"> </w:t>
+      </w:r>
+      <w:r>
+        <w:rPr>
+          <w:rStyle w:val="VerbatimChar"/>
+        </w:rPr>
+        <w:t xml:space="preserve">116.277 ms</w:t>
       </w:r>
     </w:p>
     <w:p>
@@ -2772,27 +2807,6 @@
         </w:numPr>
       </w:pPr>
       <w:r>
-        <w:t xml:space="preserve">lock-based dynamic:</w:t>
-      </w:r>
-      <w:r>
-        <w:t xml:space="preserve"> </w:t>
-      </w:r>
-      <w:r>
-        <w:rPr>
-          <w:rStyle w:val="VerbatimChar"/>
-        </w:rPr>
-        <w:t xml:space="preserve">113.080 ms</w:t>
-      </w:r>
-    </w:p>
-    <w:p>
-      <w:pPr>
-        <w:pStyle w:val="Compact"/>
-        <w:numPr>
-          <w:ilvl w:val="0"/>
-          <w:numId w:val="1013"/>
-        </w:numPr>
-      </w:pPr>
-      <w:r>
         <w:t xml:space="preserve">open addressing:</w:t>
       </w:r>
       <w:r>
@@ -2802,7 +2816,7 @@
         <w:rPr>
           <w:rStyle w:val="VerbatimChar"/>
         </w:rPr>
-        <w:t xml:space="preserve">113.517 ms</w:t>
+        <w:t xml:space="preserve">164.514 ms</w:t>
       </w:r>
     </w:p>
     <w:p>
@@ -2810,30 +2824,7 @@
         <w:pStyle w:val="FirstParagraph"/>
       </w:pPr>
       <w:r>
-        <w:t xml:space="preserve">This is effectively a tie between the two chaining-based lock-free versions, with the fixed-size version slightly ahead.</w:t>
-      </w:r>
-    </w:p>
-    <w:p>
-      <w:pPr>
-        <w:pStyle w:val="BodyText"/>
-      </w:pPr>
-      <w:r>
-        <w:t xml:space="preserve">For the balanced mix at</w:t>
-      </w:r>
-      <w:r>
-        <w:t xml:space="preserve"> </w:t>
-      </w:r>
-      <w:r>
-        <w:rPr>
-          <w:rStyle w:val="VerbatimChar"/>
-        </w:rPr>
-        <w:t xml:space="preserve">16</w:t>
-      </w:r>
-      <w:r>
-        <w:t xml:space="preserve"> </w:t>
-      </w:r>
-      <w:r>
-        <w:t xml:space="preserve">threads:</w:t>
+        <w:t xml:space="preserve">The conclusion is very useful for the report:</w:t>
       </w:r>
     </w:p>
     <w:p>
@@ -2845,16 +2836,7 @@
         </w:numPr>
       </w:pPr>
       <w:r>
-        <w:t xml:space="preserve">fixed-size lock-free chaining:</w:t>
-      </w:r>
-      <w:r>
-        <w:t xml:space="preserve"> </w:t>
-      </w:r>
-      <w:r>
-        <w:rPr>
-          <w:rStyle w:val="VerbatimChar"/>
-        </w:rPr>
-        <w:t xml:space="preserve">11.529 ms</w:t>
+        <w:t xml:space="preserve">fixed-size lock-free chaining is the best all-around design</w:t>
       </w:r>
     </w:p>
     <w:p>
@@ -2863,196 +2845,6 @@
         <w:numPr>
           <w:ilvl w:val="0"/>
           <w:numId w:val="1014"/>
-        </w:numPr>
-      </w:pPr>
-      <w:r>
-        <w:t xml:space="preserve">lock-free dynamic resize:</w:t>
-      </w:r>
-      <w:r>
-        <w:t xml:space="preserve"> </w:t>
-      </w:r>
-      <w:r>
-        <w:rPr>
-          <w:rStyle w:val="VerbatimChar"/>
-        </w:rPr>
-        <w:t xml:space="preserve">14.684 ms</w:t>
-      </w:r>
-    </w:p>
-    <w:p>
-      <w:pPr>
-        <w:pStyle w:val="Compact"/>
-        <w:numPr>
-          <w:ilvl w:val="0"/>
-          <w:numId w:val="1014"/>
-        </w:numPr>
-      </w:pPr>
-      <w:r>
-        <w:t xml:space="preserve">lock-based dynamic:</w:t>
-      </w:r>
-      <w:r>
-        <w:t xml:space="preserve"> </w:t>
-      </w:r>
-      <w:r>
-        <w:rPr>
-          <w:rStyle w:val="VerbatimChar"/>
-        </w:rPr>
-        <w:t xml:space="preserve">112.746 ms</w:t>
-      </w:r>
-    </w:p>
-    <w:p>
-      <w:pPr>
-        <w:pStyle w:val="Compact"/>
-        <w:numPr>
-          <w:ilvl w:val="0"/>
-          <w:numId w:val="1014"/>
-        </w:numPr>
-      </w:pPr>
-      <w:r>
-        <w:t xml:space="preserve">open addressing:</w:t>
-      </w:r>
-      <w:r>
-        <w:t xml:space="preserve"> </w:t>
-      </w:r>
-      <w:r>
-        <w:rPr>
-          <w:rStyle w:val="VerbatimChar"/>
-        </w:rPr>
-        <w:t xml:space="preserve">182.475 ms</w:t>
-      </w:r>
-    </w:p>
-    <w:p>
-      <w:pPr>
-        <w:pStyle w:val="FirstParagraph"/>
-      </w:pPr>
-      <w:r>
-        <w:t xml:space="preserve">For the write-heavy mix at</w:t>
-      </w:r>
-      <w:r>
-        <w:t xml:space="preserve"> </w:t>
-      </w:r>
-      <w:r>
-        <w:rPr>
-          <w:rStyle w:val="VerbatimChar"/>
-        </w:rPr>
-        <w:t xml:space="preserve">16</w:t>
-      </w:r>
-      <w:r>
-        <w:t xml:space="preserve"> </w:t>
-      </w:r>
-      <w:r>
-        <w:t xml:space="preserve">threads:</w:t>
-      </w:r>
-    </w:p>
-    <w:p>
-      <w:pPr>
-        <w:pStyle w:val="Compact"/>
-        <w:numPr>
-          <w:ilvl w:val="0"/>
-          <w:numId w:val="1015"/>
-        </w:numPr>
-      </w:pPr>
-      <w:r>
-        <w:t xml:space="preserve">lock-free dynamic resize:</w:t>
-      </w:r>
-      <w:r>
-        <w:t xml:space="preserve"> </w:t>
-      </w:r>
-      <w:r>
-        <w:rPr>
-          <w:rStyle w:val="VerbatimChar"/>
-        </w:rPr>
-        <w:t xml:space="preserve">27.564 ms</w:t>
-      </w:r>
-    </w:p>
-    <w:p>
-      <w:pPr>
-        <w:pStyle w:val="Compact"/>
-        <w:numPr>
-          <w:ilvl w:val="0"/>
-          <w:numId w:val="1015"/>
-        </w:numPr>
-      </w:pPr>
-      <w:r>
-        <w:t xml:space="preserve">fixed-size lock-free chaining:</w:t>
-      </w:r>
-      <w:r>
-        <w:t xml:space="preserve"> </w:t>
-      </w:r>
-      <w:r>
-        <w:rPr>
-          <w:rStyle w:val="VerbatimChar"/>
-        </w:rPr>
-        <w:t xml:space="preserve">31.085 ms</w:t>
-      </w:r>
-    </w:p>
-    <w:p>
-      <w:pPr>
-        <w:pStyle w:val="Compact"/>
-        <w:numPr>
-          <w:ilvl w:val="0"/>
-          <w:numId w:val="1015"/>
-        </w:numPr>
-      </w:pPr>
-      <w:r>
-        <w:t xml:space="preserve">lock-based dynamic:</w:t>
-      </w:r>
-      <w:r>
-        <w:t xml:space="preserve"> </w:t>
-      </w:r>
-      <w:r>
-        <w:rPr>
-          <w:rStyle w:val="VerbatimChar"/>
-        </w:rPr>
-        <w:t xml:space="preserve">116.277 ms</w:t>
-      </w:r>
-    </w:p>
-    <w:p>
-      <w:pPr>
-        <w:pStyle w:val="Compact"/>
-        <w:numPr>
-          <w:ilvl w:val="0"/>
-          <w:numId w:val="1015"/>
-        </w:numPr>
-      </w:pPr>
-      <w:r>
-        <w:t xml:space="preserve">open addressing:</w:t>
-      </w:r>
-      <w:r>
-        <w:t xml:space="preserve"> </w:t>
-      </w:r>
-      <w:r>
-        <w:rPr>
-          <w:rStyle w:val="VerbatimChar"/>
-        </w:rPr>
-        <w:t xml:space="preserve">164.514 ms</w:t>
-      </w:r>
-    </w:p>
-    <w:p>
-      <w:pPr>
-        <w:pStyle w:val="FirstParagraph"/>
-      </w:pPr>
-      <w:r>
-        <w:t xml:space="preserve">The conclusion is very useful for the report:</w:t>
-      </w:r>
-    </w:p>
-    <w:p>
-      <w:pPr>
-        <w:pStyle w:val="Compact"/>
-        <w:numPr>
-          <w:ilvl w:val="0"/>
-          <w:numId w:val="1016"/>
-        </w:numPr>
-      </w:pPr>
-      <w:r>
-        <w:t xml:space="preserve">fixed-size lock-free chaining is the best all-around design</w:t>
-      </w:r>
-    </w:p>
-    <w:p>
-      <w:pPr>
-        <w:pStyle w:val="Compact"/>
-        <w:numPr>
-          <w:ilvl w:val="0"/>
-          <w:numId w:val="1016"/>
         </w:numPr>
       </w:pPr>
       <w:r>
@@ -3205,6 +2997,244 @@
         <w:pStyle w:val="Compact"/>
         <w:numPr>
           <w:ilvl w:val="0"/>
+          <w:numId w:val="1015"/>
+        </w:numPr>
+      </w:pPr>
+      <w:r>
+        <w:t xml:space="preserve">fixed-size lock-free chaining:</w:t>
+      </w:r>
+      <w:r>
+        <w:t xml:space="preserve"> </w:t>
+      </w:r>
+      <w:r>
+        <w:rPr>
+          <w:rStyle w:val="VerbatimChar"/>
+        </w:rPr>
+        <w:t xml:space="preserve">12.830 ms</w:t>
+      </w:r>
+    </w:p>
+    <w:p>
+      <w:pPr>
+        <w:pStyle w:val="Compact"/>
+        <w:numPr>
+          <w:ilvl w:val="0"/>
+          <w:numId w:val="1015"/>
+        </w:numPr>
+      </w:pPr>
+      <w:r>
+        <w:t xml:space="preserve">lock-free dynamic resize:</w:t>
+      </w:r>
+      <w:r>
+        <w:t xml:space="preserve"> </w:t>
+      </w:r>
+      <w:r>
+        <w:rPr>
+          <w:rStyle w:val="VerbatimChar"/>
+        </w:rPr>
+        <w:t xml:space="preserve">20.548 ms</w:t>
+      </w:r>
+    </w:p>
+    <w:p>
+      <w:pPr>
+        <w:pStyle w:val="Compact"/>
+        <w:numPr>
+          <w:ilvl w:val="0"/>
+          <w:numId w:val="1015"/>
+        </w:numPr>
+      </w:pPr>
+      <w:r>
+        <w:t xml:space="preserve">lock-based dynamic:</w:t>
+      </w:r>
+      <w:r>
+        <w:t xml:space="preserve"> </w:t>
+      </w:r>
+      <w:r>
+        <w:rPr>
+          <w:rStyle w:val="VerbatimChar"/>
+        </w:rPr>
+        <w:t xml:space="preserve">108.458 ms</w:t>
+      </w:r>
+    </w:p>
+    <w:p>
+      <w:pPr>
+        <w:pStyle w:val="Compact"/>
+        <w:numPr>
+          <w:ilvl w:val="0"/>
+          <w:numId w:val="1015"/>
+        </w:numPr>
+      </w:pPr>
+      <w:r>
+        <w:t xml:space="preserve">open addressing:</w:t>
+      </w:r>
+      <w:r>
+        <w:t xml:space="preserve"> </w:t>
+      </w:r>
+      <w:r>
+        <w:rPr>
+          <w:rStyle w:val="VerbatimChar"/>
+        </w:rPr>
+        <w:t xml:space="preserve">138.675 ms</w:t>
+      </w:r>
+    </w:p>
+    <w:p>
+      <w:pPr>
+        <w:pStyle w:val="FirstParagraph"/>
+      </w:pPr>
+      <w:r>
+        <w:t xml:space="preserve">At</w:t>
+      </w:r>
+      <w:r>
+        <w:t xml:space="preserve"> </w:t>
+      </w:r>
+      <w:r>
+        <w:rPr>
+          <w:rStyle w:val="VerbatimChar"/>
+        </w:rPr>
+        <w:t xml:space="preserve">16</w:t>
+      </w:r>
+      <w:r>
+        <w:t xml:space="preserve"> </w:t>
+      </w:r>
+      <w:r>
+        <w:t xml:space="preserve">threads and key space</w:t>
+      </w:r>
+      <w:r>
+        <w:t xml:space="preserve"> </w:t>
+      </w:r>
+      <w:r>
+        <w:rPr>
+          <w:rStyle w:val="VerbatimChar"/>
+        </w:rPr>
+        <w:t xml:space="preserve">1024</w:t>
+      </w:r>
+      <w:r>
+        <w:t xml:space="preserve">:</w:t>
+      </w:r>
+    </w:p>
+    <w:p>
+      <w:pPr>
+        <w:pStyle w:val="Compact"/>
+        <w:numPr>
+          <w:ilvl w:val="0"/>
+          <w:numId w:val="1016"/>
+        </w:numPr>
+      </w:pPr>
+      <w:r>
+        <w:t xml:space="preserve">lock-free dynamic resize:</w:t>
+      </w:r>
+      <w:r>
+        <w:t xml:space="preserve"> </w:t>
+      </w:r>
+      <w:r>
+        <w:rPr>
+          <w:rStyle w:val="VerbatimChar"/>
+        </w:rPr>
+        <w:t xml:space="preserve">16.025 ms</w:t>
+      </w:r>
+    </w:p>
+    <w:p>
+      <w:pPr>
+        <w:pStyle w:val="Compact"/>
+        <w:numPr>
+          <w:ilvl w:val="0"/>
+          <w:numId w:val="1016"/>
+        </w:numPr>
+      </w:pPr>
+      <w:r>
+        <w:t xml:space="preserve">fixed-size lock-free chaining:</w:t>
+      </w:r>
+      <w:r>
+        <w:t xml:space="preserve"> </w:t>
+      </w:r>
+      <w:r>
+        <w:rPr>
+          <w:rStyle w:val="VerbatimChar"/>
+        </w:rPr>
+        <w:t xml:space="preserve">17.670 ms</w:t>
+      </w:r>
+    </w:p>
+    <w:p>
+      <w:pPr>
+        <w:pStyle w:val="Compact"/>
+        <w:numPr>
+          <w:ilvl w:val="0"/>
+          <w:numId w:val="1016"/>
+        </w:numPr>
+      </w:pPr>
+      <w:r>
+        <w:t xml:space="preserve">lock-based dynamic:</w:t>
+      </w:r>
+      <w:r>
+        <w:t xml:space="preserve"> </w:t>
+      </w:r>
+      <w:r>
+        <w:rPr>
+          <w:rStyle w:val="VerbatimChar"/>
+        </w:rPr>
+        <w:t xml:space="preserve">106.586 ms</w:t>
+      </w:r>
+    </w:p>
+    <w:p>
+      <w:pPr>
+        <w:pStyle w:val="Compact"/>
+        <w:numPr>
+          <w:ilvl w:val="0"/>
+          <w:numId w:val="1016"/>
+        </w:numPr>
+      </w:pPr>
+      <w:r>
+        <w:t xml:space="preserve">open addressing:</w:t>
+      </w:r>
+      <w:r>
+        <w:t xml:space="preserve"> </w:t>
+      </w:r>
+      <w:r>
+        <w:rPr>
+          <w:rStyle w:val="VerbatimChar"/>
+        </w:rPr>
+        <w:t xml:space="preserve">150.352 ms</w:t>
+      </w:r>
+    </w:p>
+    <w:p>
+      <w:pPr>
+        <w:pStyle w:val="FirstParagraph"/>
+      </w:pPr>
+      <w:r>
+        <w:t xml:space="preserve">At</w:t>
+      </w:r>
+      <w:r>
+        <w:t xml:space="preserve"> </w:t>
+      </w:r>
+      <w:r>
+        <w:rPr>
+          <w:rStyle w:val="VerbatimChar"/>
+        </w:rPr>
+        <w:t xml:space="preserve">16</w:t>
+      </w:r>
+      <w:r>
+        <w:t xml:space="preserve"> </w:t>
+      </w:r>
+      <w:r>
+        <w:t xml:space="preserve">threads and key space</w:t>
+      </w:r>
+      <w:r>
+        <w:t xml:space="preserve"> </w:t>
+      </w:r>
+      <w:r>
+        <w:rPr>
+          <w:rStyle w:val="VerbatimChar"/>
+        </w:rPr>
+        <w:t xml:space="preserve">65536</w:t>
+      </w:r>
+      <w:r>
+        <w:t xml:space="preserve">:</w:t>
+      </w:r>
+    </w:p>
+    <w:p>
+      <w:pPr>
+        <w:pStyle w:val="Compact"/>
+        <w:numPr>
+          <w:ilvl w:val="0"/>
           <w:numId w:val="1017"/>
         </w:numPr>
       </w:pPr>
@@ -3218,7 +3248,7 @@
         <w:rPr>
           <w:rStyle w:val="VerbatimChar"/>
         </w:rPr>
-        <w:t xml:space="preserve">12.830 ms</w:t>
+        <w:t xml:space="preserve">11.350 ms</w:t>
       </w:r>
     </w:p>
     <w:p>
@@ -3239,7 +3269,7 @@
         <w:rPr>
           <w:rStyle w:val="VerbatimChar"/>
         </w:rPr>
-        <w:t xml:space="preserve">20.548 ms</w:t>
+        <w:t xml:space="preserve">11.968 ms</w:t>
       </w:r>
     </w:p>
     <w:p>
@@ -3260,7 +3290,7 @@
         <w:rPr>
           <w:rStyle w:val="VerbatimChar"/>
         </w:rPr>
-        <w:t xml:space="preserve">108.458 ms</w:t>
+        <w:t xml:space="preserve">124.141 ms</w:t>
       </w:r>
     </w:p>
     <w:p>
@@ -3281,7 +3311,7 @@
         <w:rPr>
           <w:rStyle w:val="VerbatimChar"/>
         </w:rPr>
-        <w:t xml:space="preserve">138.675 ms</w:t>
+        <w:t xml:space="preserve">139.693 ms</w:t>
       </w:r>
     </w:p>
     <w:p>
@@ -3289,34 +3319,7 @@
         <w:pStyle w:val="FirstParagraph"/>
       </w:pPr>
       <w:r>
-        <w:t xml:space="preserve">At</w:t>
-      </w:r>
-      <w:r>
-        <w:t xml:space="preserve"> </w:t>
-      </w:r>
-      <w:r>
-        <w:rPr>
-          <w:rStyle w:val="VerbatimChar"/>
-        </w:rPr>
-        <w:t xml:space="preserve">16</w:t>
-      </w:r>
-      <w:r>
-        <w:t xml:space="preserve"> </w:t>
-      </w:r>
-      <w:r>
-        <w:t xml:space="preserve">threads and key space</w:t>
-      </w:r>
-      <w:r>
-        <w:t xml:space="preserve"> </w:t>
-      </w:r>
-      <w:r>
-        <w:rPr>
-          <w:rStyle w:val="VerbatimChar"/>
-        </w:rPr>
-        <w:t xml:space="preserve">1024</w:t>
-      </w:r>
-      <w:r>
-        <w:t xml:space="preserve">:</w:t>
+        <w:t xml:space="preserve">This experiment reveals an important tradeoff:</w:t>
       </w:r>
     </w:p>
     <w:p>
@@ -3328,16 +3331,7 @@
         </w:numPr>
       </w:pPr>
       <w:r>
-        <w:t xml:space="preserve">lock-free dynamic resize:</w:t>
-      </w:r>
-      <w:r>
-        <w:t xml:space="preserve"> </w:t>
-      </w:r>
-      <w:r>
-        <w:rPr>
-          <w:rStyle w:val="VerbatimChar"/>
-        </w:rPr>
-        <w:t xml:space="preserve">16.025 ms</w:t>
+        <w:t xml:space="preserve">the fixed-size lock-free chaining map is best under extreme same-key contention</w:t>
       </w:r>
     </w:p>
     <w:p>
@@ -3349,16 +3343,7 @@
         </w:numPr>
       </w:pPr>
       <w:r>
-        <w:t xml:space="preserve">fixed-size lock-free chaining:</w:t>
-      </w:r>
-      <w:r>
-        <w:t xml:space="preserve"> </w:t>
-      </w:r>
-      <w:r>
-        <w:rPr>
-          <w:rStyle w:val="VerbatimChar"/>
-        </w:rPr>
-        <w:t xml:space="preserve">17.670 ms</w:t>
+        <w:t xml:space="preserve">the dynamic-resizing lock-free version is best under moderate contention</w:t>
       </w:r>
     </w:p>
     <w:p>
@@ -3367,199 +3352,6 @@
         <w:numPr>
           <w:ilvl w:val="0"/>
           <w:numId w:val="1018"/>
-        </w:numPr>
-      </w:pPr>
-      <w:r>
-        <w:t xml:space="preserve">lock-based dynamic:</w:t>
-      </w:r>
-      <w:r>
-        <w:t xml:space="preserve"> </w:t>
-      </w:r>
-      <w:r>
-        <w:rPr>
-          <w:rStyle w:val="VerbatimChar"/>
-        </w:rPr>
-        <w:t xml:space="preserve">106.586 ms</w:t>
-      </w:r>
-    </w:p>
-    <w:p>
-      <w:pPr>
-        <w:pStyle w:val="Compact"/>
-        <w:numPr>
-          <w:ilvl w:val="0"/>
-          <w:numId w:val="1018"/>
-        </w:numPr>
-      </w:pPr>
-      <w:r>
-        <w:t xml:space="preserve">open addressing:</w:t>
-      </w:r>
-      <w:r>
-        <w:t xml:space="preserve"> </w:t>
-      </w:r>
-      <w:r>
-        <w:rPr>
-          <w:rStyle w:val="VerbatimChar"/>
-        </w:rPr>
-        <w:t xml:space="preserve">150.352 ms</w:t>
-      </w:r>
-    </w:p>
-    <w:p>
-      <w:pPr>
-        <w:pStyle w:val="FirstParagraph"/>
-      </w:pPr>
-      <w:r>
-        <w:t xml:space="preserve">At</w:t>
-      </w:r>
-      <w:r>
-        <w:t xml:space="preserve"> </w:t>
-      </w:r>
-      <w:r>
-        <w:rPr>
-          <w:rStyle w:val="VerbatimChar"/>
-        </w:rPr>
-        <w:t xml:space="preserve">16</w:t>
-      </w:r>
-      <w:r>
-        <w:t xml:space="preserve"> </w:t>
-      </w:r>
-      <w:r>
-        <w:t xml:space="preserve">threads and key space</w:t>
-      </w:r>
-      <w:r>
-        <w:t xml:space="preserve"> </w:t>
-      </w:r>
-      <w:r>
-        <w:rPr>
-          <w:rStyle w:val="VerbatimChar"/>
-        </w:rPr>
-        <w:t xml:space="preserve">65536</w:t>
-      </w:r>
-      <w:r>
-        <w:t xml:space="preserve">:</w:t>
-      </w:r>
-    </w:p>
-    <w:p>
-      <w:pPr>
-        <w:pStyle w:val="Compact"/>
-        <w:numPr>
-          <w:ilvl w:val="0"/>
-          <w:numId w:val="1019"/>
-        </w:numPr>
-      </w:pPr>
-      <w:r>
-        <w:t xml:space="preserve">fixed-size lock-free chaining:</w:t>
-      </w:r>
-      <w:r>
-        <w:t xml:space="preserve"> </w:t>
-      </w:r>
-      <w:r>
-        <w:rPr>
-          <w:rStyle w:val="VerbatimChar"/>
-        </w:rPr>
-        <w:t xml:space="preserve">11.350 ms</w:t>
-      </w:r>
-    </w:p>
-    <w:p>
-      <w:pPr>
-        <w:pStyle w:val="Compact"/>
-        <w:numPr>
-          <w:ilvl w:val="0"/>
-          <w:numId w:val="1019"/>
-        </w:numPr>
-      </w:pPr>
-      <w:r>
-        <w:t xml:space="preserve">lock-free dynamic resize:</w:t>
-      </w:r>
-      <w:r>
-        <w:t xml:space="preserve"> </w:t>
-      </w:r>
-      <w:r>
-        <w:rPr>
-          <w:rStyle w:val="VerbatimChar"/>
-        </w:rPr>
-        <w:t xml:space="preserve">11.968 ms</w:t>
-      </w:r>
-    </w:p>
-    <w:p>
-      <w:pPr>
-        <w:pStyle w:val="Compact"/>
-        <w:numPr>
-          <w:ilvl w:val="0"/>
-          <w:numId w:val="1019"/>
-        </w:numPr>
-      </w:pPr>
-      <w:r>
-        <w:t xml:space="preserve">lock-based dynamic:</w:t>
-      </w:r>
-      <w:r>
-        <w:t xml:space="preserve"> </w:t>
-      </w:r>
-      <w:r>
-        <w:rPr>
-          <w:rStyle w:val="VerbatimChar"/>
-        </w:rPr>
-        <w:t xml:space="preserve">124.141 ms</w:t>
-      </w:r>
-    </w:p>
-    <w:p>
-      <w:pPr>
-        <w:pStyle w:val="Compact"/>
-        <w:numPr>
-          <w:ilvl w:val="0"/>
-          <w:numId w:val="1019"/>
-        </w:numPr>
-      </w:pPr>
-      <w:r>
-        <w:t xml:space="preserve">open addressing:</w:t>
-      </w:r>
-      <w:r>
-        <w:t xml:space="preserve"> </w:t>
-      </w:r>
-      <w:r>
-        <w:rPr>
-          <w:rStyle w:val="VerbatimChar"/>
-        </w:rPr>
-        <w:t xml:space="preserve">139.693 ms</w:t>
-      </w:r>
-    </w:p>
-    <w:p>
-      <w:pPr>
-        <w:pStyle w:val="FirstParagraph"/>
-      </w:pPr>
-      <w:r>
-        <w:t xml:space="preserve">This experiment reveals an important tradeoff:</w:t>
-      </w:r>
-    </w:p>
-    <w:p>
-      <w:pPr>
-        <w:pStyle w:val="Compact"/>
-        <w:numPr>
-          <w:ilvl w:val="0"/>
-          <w:numId w:val="1020"/>
-        </w:numPr>
-      </w:pPr>
-      <w:r>
-        <w:t xml:space="preserve">the fixed-size lock-free chaining map is best under extreme same-key contention</w:t>
-      </w:r>
-    </w:p>
-    <w:p>
-      <w:pPr>
-        <w:pStyle w:val="Compact"/>
-        <w:numPr>
-          <w:ilvl w:val="0"/>
-          <w:numId w:val="1020"/>
-        </w:numPr>
-      </w:pPr>
-      <w:r>
-        <w:t xml:space="preserve">the dynamic-resizing lock-free version is best under moderate contention</w:t>
-      </w:r>
-    </w:p>
-    <w:p>
-      <w:pPr>
-        <w:pStyle w:val="Compact"/>
-        <w:numPr>
-          <w:ilvl w:val="0"/>
-          <w:numId w:val="1020"/>
         </w:numPr>
       </w:pPr>
       <w:r>
@@ -3735,7 +3527,7 @@
         <w:pStyle w:val="Compact"/>
         <w:numPr>
           <w:ilvl w:val="0"/>
-          <w:numId w:val="1021"/>
+          <w:numId w:val="1019"/>
         </w:numPr>
       </w:pPr>
       <w:r>
@@ -3756,7 +3548,7 @@
         <w:pStyle w:val="Compact"/>
         <w:numPr>
           <w:ilvl w:val="0"/>
-          <w:numId w:val="1021"/>
+          <w:numId w:val="1019"/>
         </w:numPr>
       </w:pPr>
       <w:r>
@@ -3777,7 +3569,7 @@
         <w:pStyle w:val="Compact"/>
         <w:numPr>
           <w:ilvl w:val="0"/>
-          <w:numId w:val="1021"/>
+          <w:numId w:val="1019"/>
         </w:numPr>
       </w:pPr>
       <w:r>
@@ -3836,7 +3628,7 @@
         <w:pStyle w:val="Compact"/>
         <w:numPr>
           <w:ilvl w:val="0"/>
-          <w:numId w:val="1022"/>
+          <w:numId w:val="1020"/>
         </w:numPr>
       </w:pPr>
       <w:r>
@@ -3857,7 +3649,7 @@
         <w:pStyle w:val="Compact"/>
         <w:numPr>
           <w:ilvl w:val="0"/>
-          <w:numId w:val="1022"/>
+          <w:numId w:val="1020"/>
         </w:numPr>
       </w:pPr>
       <w:r>
@@ -3878,7 +3670,7 @@
         <w:pStyle w:val="Compact"/>
         <w:numPr>
           <w:ilvl w:val="0"/>
-          <w:numId w:val="1022"/>
+          <w:numId w:val="1020"/>
         </w:numPr>
       </w:pPr>
       <w:r>
@@ -4047,7 +3839,7 @@
         <w:pStyle w:val="Compact"/>
         <w:numPr>
           <w:ilvl w:val="0"/>
-          <w:numId w:val="1023"/>
+          <w:numId w:val="1021"/>
         </w:numPr>
       </w:pPr>
       <w:r>
@@ -4059,7 +3851,7 @@
         <w:pStyle w:val="Compact"/>
         <w:numPr>
           <w:ilvl w:val="0"/>
-          <w:numId w:val="1023"/>
+          <w:numId w:val="1021"/>
         </w:numPr>
       </w:pPr>
       <w:r>
@@ -4071,7 +3863,7 @@
         <w:pStyle w:val="Compact"/>
         <w:numPr>
           <w:ilvl w:val="0"/>
-          <w:numId w:val="1023"/>
+          <w:numId w:val="1021"/>
         </w:numPr>
       </w:pPr>
       <w:r>
@@ -4083,7 +3875,7 @@
         <w:pStyle w:val="Compact"/>
         <w:numPr>
           <w:ilvl w:val="0"/>
-          <w:numId w:val="1023"/>
+          <w:numId w:val="1021"/>
         </w:numPr>
       </w:pPr>
       <w:r>
@@ -4126,7 +3918,7 @@
         <w:pStyle w:val="Compact"/>
         <w:numPr>
           <w:ilvl w:val="0"/>
-          <w:numId w:val="1024"/>
+          <w:numId w:val="1022"/>
         </w:numPr>
       </w:pPr>
       <w:r>
@@ -4150,7 +3942,7 @@
         <w:pStyle w:val="Compact"/>
         <w:numPr>
           <w:ilvl w:val="0"/>
-          <w:numId w:val="1024"/>
+          <w:numId w:val="1022"/>
         </w:numPr>
       </w:pPr>
       <w:r>
@@ -4162,7 +3954,7 @@
         <w:pStyle w:val="Compact"/>
         <w:numPr>
           <w:ilvl w:val="0"/>
-          <w:numId w:val="1024"/>
+          <w:numId w:val="1022"/>
         </w:numPr>
       </w:pPr>
       <w:r>
@@ -4613,12 +4405,6 @@
     <w:abstractNumId w:val="991"/>
   </w:num>
   <w:num w:numId="1022">
-    <w:abstractNumId w:val="991"/>
-  </w:num>
-  <w:num w:numId="1023">
-    <w:abstractNumId w:val="991"/>
-  </w:num>
-  <w:num w:numId="1024">
     <w:abstractNumId w:val="991"/>
   </w:num>
 </w:numbering>

</xml_diff>

<commit_message>
Refresh report with final benchmark data
</commit_message>
<xml_diff>
--- a/report/report.docx
+++ b/report/report.docx
@@ -1589,7 +1589,52 @@
         <w:pStyle w:val="FirstParagraph"/>
       </w:pPr>
       <w:r>
-        <w:t xml:space="preserve">The broadest conclusion from the project is simple: the two chaining-based lock-free designs dominate the lock-based baseline and the open-addressing experiment in most concurrent scenarios.</w:t>
+        <w:t xml:space="preserve">The broadest conclusion from the project is simple: the chaining-based lock-free designs dominate the lock-based baseline and the open-addressing experiment in the main benchmark. The strongest final benchmark was run on the target machine with</w:t>
+      </w:r>
+      <w:r>
+        <w:t xml:space="preserve"> </w:t>
+      </w:r>
+      <w:r>
+        <w:rPr>
+          <w:rStyle w:val="VerbatimChar"/>
+        </w:rPr>
+        <w:t xml:space="preserve">800000</w:t>
+      </w:r>
+      <w:r>
+        <w:t xml:space="preserve"> </w:t>
+      </w:r>
+      <w:r>
+        <w:t xml:space="preserve">operations,</w:t>
+      </w:r>
+      <w:r>
+        <w:t xml:space="preserve"> </w:t>
+      </w:r>
+      <w:r>
+        <w:rPr>
+          <w:rStyle w:val="VerbatimChar"/>
+        </w:rPr>
+        <w:t xml:space="preserve">131072</w:t>
+      </w:r>
+      <w:r>
+        <w:t xml:space="preserve"> </w:t>
+      </w:r>
+      <w:r>
+        <w:t xml:space="preserve">buckets, and up to</w:t>
+      </w:r>
+      <w:r>
+        <w:t xml:space="preserve"> </w:t>
+      </w:r>
+      <w:r>
+        <w:rPr>
+          <w:rStyle w:val="VerbatimChar"/>
+        </w:rPr>
+        <w:t xml:space="preserve">8</w:t>
+      </w:r>
+      <w:r>
+        <w:t xml:space="preserve"> </w:t>
+      </w:r>
+      <w:r>
+        <w:t xml:space="preserve">threads.</w:t>
       </w:r>
     </w:p>
     <w:p>
@@ -1597,7 +1642,22 @@
         <w:pStyle w:val="BodyText"/>
       </w:pPr>
       <w:r>
-        <w:t xml:space="preserve">The fixed-size lock-free chaining map is the best overall implementation in the project. It wins most</w:t>
+        <w:t xml:space="preserve">In that final benchmark, the fixed-size lock-free chaining map won every</w:t>
+      </w:r>
+      <w:r>
+        <w:t xml:space="preserve"> </w:t>
+      </w:r>
+      <w:r>
+        <w:rPr>
+          <w:rStyle w:val="VerbatimChar"/>
+        </w:rPr>
+        <w:t xml:space="preserve">PUT</w:t>
+      </w:r>
+      <w:r>
+        <w:t xml:space="preserve"> </w:t>
+      </w:r>
+      <w:r>
+        <w:t xml:space="preserve">case, every</w:t>
       </w:r>
       <w:r>
         <w:t xml:space="preserve"> </w:t>
@@ -1612,22 +1672,22 @@
         <w:t xml:space="preserve"> </w:t>
       </w:r>
       <w:r>
-        <w:t xml:space="preserve">scenarios, most balanced mixed scenarios, and remains strong even when it does not come first. The dynamic-resizing lock-free version is the best writer. It wins most</w:t>
-      </w:r>
-      <w:r>
-        <w:t xml:space="preserve"> </w:t>
-      </w:r>
-      <w:r>
-        <w:rPr>
-          <w:rStyle w:val="VerbatimChar"/>
-        </w:rPr>
-        <w:t xml:space="preserve">PUT</w:t>
-      </w:r>
-      <w:r>
-        <w:t xml:space="preserve"> </w:t>
-      </w:r>
-      <w:r>
-        <w:t xml:space="preserve">scenarios and becomes especially attractive when insertion pressure or write-heavy behavior is important.</w:t>
+        <w:t xml:space="preserve">case, and three of the four mixed-workload cases. The dynamic-resizing lock-free version remained competitive and won one mixed-workload point at</w:t>
+      </w:r>
+      <w:r>
+        <w:t xml:space="preserve"> </w:t>
+      </w:r>
+      <w:r>
+        <w:rPr>
+          <w:rStyle w:val="VerbatimChar"/>
+        </w:rPr>
+        <w:t xml:space="preserve">4</w:t>
+      </w:r>
+      <w:r>
+        <w:t xml:space="preserve"> </w:t>
+      </w:r>
+      <w:r>
+        <w:t xml:space="preserve">threads. The lock-based dynamic map was consistently much slower, and the open-addressing experiment was the weakest design overall.</w:t>
       </w:r>
     </w:p>
     <w:p>
@@ -1635,7 +1695,7 @@
         <w:pStyle w:val="BodyText"/>
       </w:pPr>
       <w:r>
-        <w:t xml:space="preserve">The lock-based dynamic map is useful as a baseline because it is simple and correct, but it is usually much slower once thread count increases. The open-addressing experiment gave useful insight into locality-driven design, but it did not remain competitive in the broad benchmark suite.</w:t>
+        <w:t xml:space="preserve">This confirms the overall project result: the fixed-size lock-free chaining map is the best final implementation, while the dynamic-resizing lock-free version is best treated as a useful but more specialized extension.</w:t>
       </w:r>
     </w:p>
     <w:bookmarkEnd w:id="41"/>
@@ -1653,7 +1713,137 @@
         <w:pStyle w:val="FirstParagraph"/>
       </w:pPr>
       <w:r>
-        <w:t xml:space="preserve">The</w:t>
+        <w:t xml:space="preserve">The final benchmark shows that the fixed-size lock-free chaining map is the strongest insertion design in the final submission branch. It wins at every tested thread count.</w:t>
+      </w:r>
+    </w:p>
+    <w:p>
+      <w:pPr>
+        <w:pStyle w:val="BodyText"/>
+      </w:pPr>
+      <w:r>
+        <w:t xml:space="preserve">At</w:t>
+      </w:r>
+      <w:r>
+        <w:t xml:space="preserve"> </w:t>
+      </w:r>
+      <w:r>
+        <w:rPr>
+          <w:rStyle w:val="VerbatimChar"/>
+        </w:rPr>
+        <w:t xml:space="preserve">131072</w:t>
+      </w:r>
+      <w:r>
+        <w:t xml:space="preserve"> </w:t>
+      </w:r>
+      <w:r>
+        <w:t xml:space="preserve">buckets and</w:t>
+      </w:r>
+      <w:r>
+        <w:t xml:space="preserve"> </w:t>
+      </w:r>
+      <w:r>
+        <w:rPr>
+          <w:rStyle w:val="VerbatimChar"/>
+        </w:rPr>
+        <w:t xml:space="preserve">8</w:t>
+      </w:r>
+      <w:r>
+        <w:t xml:space="preserve"> </w:t>
+      </w:r>
+      <w:r>
+        <w:t xml:space="preserve">threads:</w:t>
+      </w:r>
+    </w:p>
+    <w:p>
+      <w:pPr>
+        <w:pStyle w:val="Compact"/>
+        <w:numPr>
+          <w:ilvl w:val="0"/>
+          <w:numId w:val="1008"/>
+        </w:numPr>
+      </w:pPr>
+      <w:r>
+        <w:t xml:space="preserve">fixed-size lock-free chaining:</w:t>
+      </w:r>
+      <w:r>
+        <w:t xml:space="preserve"> </w:t>
+      </w:r>
+      <w:r>
+        <w:rPr>
+          <w:rStyle w:val="VerbatimChar"/>
+        </w:rPr>
+        <w:t xml:space="preserve">43.1 ms</w:t>
+      </w:r>
+    </w:p>
+    <w:p>
+      <w:pPr>
+        <w:pStyle w:val="Compact"/>
+        <w:numPr>
+          <w:ilvl w:val="0"/>
+          <w:numId w:val="1008"/>
+        </w:numPr>
+      </w:pPr>
+      <w:r>
+        <w:t xml:space="preserve">lock-free dynamic resize:</w:t>
+      </w:r>
+      <w:r>
+        <w:t xml:space="preserve"> </w:t>
+      </w:r>
+      <w:r>
+        <w:rPr>
+          <w:rStyle w:val="VerbatimChar"/>
+        </w:rPr>
+        <w:t xml:space="preserve">54.5 ms</w:t>
+      </w:r>
+    </w:p>
+    <w:p>
+      <w:pPr>
+        <w:pStyle w:val="Compact"/>
+        <w:numPr>
+          <w:ilvl w:val="0"/>
+          <w:numId w:val="1008"/>
+        </w:numPr>
+      </w:pPr>
+      <w:r>
+        <w:t xml:space="preserve">lock-based dynamic:</w:t>
+      </w:r>
+      <w:r>
+        <w:t xml:space="preserve"> </w:t>
+      </w:r>
+      <w:r>
+        <w:rPr>
+          <w:rStyle w:val="VerbatimChar"/>
+        </w:rPr>
+        <w:t xml:space="preserve">309.6 ms</w:t>
+      </w:r>
+    </w:p>
+    <w:p>
+      <w:pPr>
+        <w:pStyle w:val="Compact"/>
+        <w:numPr>
+          <w:ilvl w:val="0"/>
+          <w:numId w:val="1008"/>
+        </w:numPr>
+      </w:pPr>
+      <w:r>
+        <w:t xml:space="preserve">open addressing:</w:t>
+      </w:r>
+      <w:r>
+        <w:t xml:space="preserve"> </w:t>
+      </w:r>
+      <w:r>
+        <w:rPr>
+          <w:rStyle w:val="VerbatimChar"/>
+        </w:rPr>
+        <w:t xml:space="preserve">597.9 ms</w:t>
+      </w:r>
+    </w:p>
+    <w:p>
+      <w:pPr>
+        <w:pStyle w:val="FirstParagraph"/>
+      </w:pPr>
+      <w:r>
+        <w:t xml:space="preserve">This is a large gap, not a marginal one. The fixed-size lock-free chaining map is about seven times faster than the lock-based baseline in this</w:t>
       </w:r>
       <w:r>
         <w:t xml:space="preserve"> </w:t>
@@ -1668,37 +1858,7 @@
         <w:t xml:space="preserve"> </w:t>
       </w:r>
       <w:r>
-        <w:t xml:space="preserve">results show the clearest advantage for the dynamic-resizing lock-free map. In the main sweep, it wins 12 of the 15</w:t>
-      </w:r>
-      <w:r>
-        <w:t xml:space="preserve"> </w:t>
-      </w:r>
-      <w:r>
-        <w:rPr>
-          <w:rStyle w:val="VerbatimChar"/>
-        </w:rPr>
-        <w:t xml:space="preserve">PUT</w:t>
-      </w:r>
-      <w:r>
-        <w:t xml:space="preserve"> </w:t>
-      </w:r>
-      <w:r>
-        <w:t xml:space="preserve">scenarios. The only</w:t>
-      </w:r>
-      <w:r>
-        <w:t xml:space="preserve"> </w:t>
-      </w:r>
-      <w:r>
-        <w:rPr>
-          <w:rStyle w:val="VerbatimChar"/>
-        </w:rPr>
-        <w:t xml:space="preserve">PUT</w:t>
-      </w:r>
-      <w:r>
-        <w:t xml:space="preserve"> </w:t>
-      </w:r>
-      <w:r>
-        <w:t xml:space="preserve">cases it does not win are the three single-thread cases, where open addressing is slightly faster.</w:t>
+        <w:t xml:space="preserve">configuration, and it is still clearly ahead of the dynamic-resizing version.</w:t>
       </w:r>
     </w:p>
     <w:p>
@@ -1706,137 +1866,7 @@
         <w:pStyle w:val="BodyText"/>
       </w:pPr>
       <w:r>
-        <w:t xml:space="preserve">The important point is that this is not just a small edge. At</w:t>
-      </w:r>
-      <w:r>
-        <w:t xml:space="preserve"> </w:t>
-      </w:r>
-      <w:r>
-        <w:rPr>
-          <w:rStyle w:val="VerbatimChar"/>
-        </w:rPr>
-        <w:t xml:space="preserve">262144</w:t>
-      </w:r>
-      <w:r>
-        <w:t xml:space="preserve"> </w:t>
-      </w:r>
-      <w:r>
-        <w:t xml:space="preserve">buckets and</w:t>
-      </w:r>
-      <w:r>
-        <w:t xml:space="preserve"> </w:t>
-      </w:r>
-      <w:r>
-        <w:rPr>
-          <w:rStyle w:val="VerbatimChar"/>
-        </w:rPr>
-        <w:t xml:space="preserve">16</w:t>
-      </w:r>
-      <w:r>
-        <w:t xml:space="preserve"> </w:t>
-      </w:r>
-      <w:r>
-        <w:t xml:space="preserve">threads:</w:t>
-      </w:r>
-    </w:p>
-    <w:p>
-      <w:pPr>
-        <w:pStyle w:val="Compact"/>
-        <w:numPr>
-          <w:ilvl w:val="0"/>
-          <w:numId w:val="1008"/>
-        </w:numPr>
-      </w:pPr>
-      <w:r>
-        <w:t xml:space="preserve">lock-free dynamic resize:</w:t>
-      </w:r>
-      <w:r>
-        <w:t xml:space="preserve"> </w:t>
-      </w:r>
-      <w:r>
-        <w:rPr>
-          <w:rStyle w:val="VerbatimChar"/>
-        </w:rPr>
-        <w:t xml:space="preserve">14.937 ms</w:t>
-      </w:r>
-    </w:p>
-    <w:p>
-      <w:pPr>
-        <w:pStyle w:val="Compact"/>
-        <w:numPr>
-          <w:ilvl w:val="0"/>
-          <w:numId w:val="1008"/>
-        </w:numPr>
-      </w:pPr>
-      <w:r>
-        <w:t xml:space="preserve">fixed-size lock-free chaining:</w:t>
-      </w:r>
-      <w:r>
-        <w:t xml:space="preserve"> </w:t>
-      </w:r>
-      <w:r>
-        <w:rPr>
-          <w:rStyle w:val="VerbatimChar"/>
-        </w:rPr>
-        <w:t xml:space="preserve">19.502 ms</w:t>
-      </w:r>
-    </w:p>
-    <w:p>
-      <w:pPr>
-        <w:pStyle w:val="Compact"/>
-        <w:numPr>
-          <w:ilvl w:val="0"/>
-          <w:numId w:val="1008"/>
-        </w:numPr>
-      </w:pPr>
-      <w:r>
-        <w:t xml:space="preserve">lock-based dynamic:</w:t>
-      </w:r>
-      <w:r>
-        <w:t xml:space="preserve"> </w:t>
-      </w:r>
-      <w:r>
-        <w:rPr>
-          <w:rStyle w:val="VerbatimChar"/>
-        </w:rPr>
-        <w:t xml:space="preserve">44.044 ms</w:t>
-      </w:r>
-    </w:p>
-    <w:p>
-      <w:pPr>
-        <w:pStyle w:val="Compact"/>
-        <w:numPr>
-          <w:ilvl w:val="0"/>
-          <w:numId w:val="1008"/>
-        </w:numPr>
-      </w:pPr>
-      <w:r>
-        <w:t xml:space="preserve">open addressing:</w:t>
-      </w:r>
-      <w:r>
-        <w:t xml:space="preserve"> </w:t>
-      </w:r>
-      <w:r>
-        <w:rPr>
-          <w:rStyle w:val="VerbatimChar"/>
-        </w:rPr>
-        <w:t xml:space="preserve">48.902 ms</w:t>
-      </w:r>
-    </w:p>
-    <w:p>
-      <w:pPr>
-        <w:pStyle w:val="FirstParagraph"/>
-      </w:pPr>
-      <w:r>
-        <w:t xml:space="preserve">The dynamic-resizing lock-free design is therefore the strongest insertion design in the project.</w:t>
-      </w:r>
-    </w:p>
-    <w:p>
-      <w:pPr>
-        <w:pStyle w:val="BodyText"/>
-      </w:pPr>
-      <w:r>
-        <w:t xml:space="preserve">The likely reason is that writes benefit from both reduced lock contention and relief from fixed-size bucket pressure. A fixed-size table can still perform well, but once insertion pressure grows, the resizing version can absorb that growth more gracefully.</w:t>
+        <w:t xml:space="preserve">The likely reason is that the fixed-size lock-free version keeps the write path simple: no bucket locks, no resize coordination, and no probing overhead. The dynamic-resizing version still pays extra bookkeeping cost even when resizing is not the best tradeoff for this specific workload.</w:t>
       </w:r>
     </w:p>
     <w:p>
@@ -1846,14 +1876,14 @@
       <w:r>
         <w:drawing>
           <wp:inline>
-            <wp:extent cx="5334000" cy="3111500"/>
+            <wp:extent cx="5334000" cy="3556000"/>
             <wp:effectExtent b="0" l="0" r="0" t="0"/>
-            <wp:docPr descr="PUT throughput at 262144 buckets" title="" id="43" name="Picture"/>
+            <wp:docPr descr="PUT throughput at 131072 buckets" title="" id="43" name="Picture"/>
             <a:graphic>
               <a:graphicData uri="http://schemas.openxmlformats.org/drawingml/2006/picture">
                 <pic:pic>
                   <pic:nvPicPr>
-                    <pic:cNvPr descr="/Users/kvlnraju/College/courses/semester-4/multi-core/project/concurrent-hash-map/report/figures/put_262144.png" id="44" name="Picture"/>
+                    <pic:cNvPr descr="/Users/kvlnraju/College/courses/semester-4/multi-core/project/concurrent-hash-map/report/figures/put_131072_final.png" id="44" name="Picture"/>
                     <pic:cNvPicPr>
                       <a:picLocks noChangeArrowheads="1" noChangeAspect="1"/>
                     </pic:cNvPicPr>
@@ -1867,7 +1897,7 @@
                   <pic:spPr bwMode="auto">
                     <a:xfrm>
                       <a:off x="0" y="0"/>
-                      <a:ext cx="5334000" cy="3111500"/>
+                      <a:ext cx="5334000" cy="3556000"/>
                     </a:xfrm>
                     <a:prstGeom prst="rect">
                       <a:avLst/>
@@ -1891,7 +1921,7 @@
         <w:pStyle w:val="ImageCaption"/>
       </w:pPr>
       <w:r>
-        <w:t xml:space="preserve">PUT throughput at 262144 buckets</w:t>
+        <w:t xml:space="preserve">PUT throughput at 131072 buckets</w:t>
       </w:r>
     </w:p>
     <w:p>
@@ -1918,22 +1948,34 @@
         <w:t xml:space="preserve"> </w:t>
       </w:r>
       <w:r>
-        <w:t xml:space="preserve">throughput at</w:t>
-      </w:r>
-      <w:r>
-        <w:t xml:space="preserve"> </w:t>
-      </w:r>
-      <w:r>
-        <w:rPr>
-          <w:rStyle w:val="VerbatimChar"/>
-        </w:rPr>
-        <w:t xml:space="preserve">262144</w:t>
-      </w:r>
-      <w:r>
-        <w:t xml:space="preserve"> </w:t>
-      </w:r>
-      <w:r>
-        <w:t xml:space="preserve">buckets. The dynamic-resizing lock-free chaining map is the best writer once concurrency becomes significant.</w:t>
+        <w:t xml:space="preserve">throughput in the final benchmark (</w:t>
+      </w:r>
+      <w:r>
+        <w:rPr>
+          <w:rStyle w:val="VerbatimChar"/>
+        </w:rPr>
+        <w:t xml:space="preserve">800000</w:t>
+      </w:r>
+      <w:r>
+        <w:t xml:space="preserve"> </w:t>
+      </w:r>
+      <w:r>
+        <w:t xml:space="preserve">operations,</w:t>
+      </w:r>
+      <w:r>
+        <w:t xml:space="preserve"> </w:t>
+      </w:r>
+      <w:r>
+        <w:rPr>
+          <w:rStyle w:val="VerbatimChar"/>
+        </w:rPr>
+        <w:t xml:space="preserve">131072</w:t>
+      </w:r>
+      <w:r>
+        <w:t xml:space="preserve"> </w:t>
+      </w:r>
+      <w:r>
+        <w:t xml:space="preserve">buckets). The fixed-size lock-free chaining map is the strongest writer at every tested thread count.</w:t>
       </w:r>
     </w:p>
     <w:bookmarkEnd w:id="45"/>
@@ -1998,7 +2040,7 @@
         <w:rPr>
           <w:rStyle w:val="VerbatimChar"/>
         </w:rPr>
-        <w:t xml:space="preserve">1048576</w:t>
+        <w:t xml:space="preserve">131072</w:t>
       </w:r>
       <w:r>
         <w:t xml:space="preserve"> </w:t>
@@ -2013,7 +2055,7 @@
         <w:rPr>
           <w:rStyle w:val="VerbatimChar"/>
         </w:rPr>
-        <w:t xml:space="preserve">16</w:t>
+        <w:t xml:space="preserve">8</w:t>
       </w:r>
       <w:r>
         <w:t xml:space="preserve"> </w:t>
@@ -2040,7 +2082,7 @@
         <w:rPr>
           <w:rStyle w:val="VerbatimChar"/>
         </w:rPr>
-        <w:t xml:space="preserve">8.926 ms</w:t>
+        <w:t xml:space="preserve">4.4 ms</w:t>
       </w:r>
     </w:p>
     <w:p>
@@ -2061,7 +2103,7 @@
         <w:rPr>
           <w:rStyle w:val="VerbatimChar"/>
         </w:rPr>
-        <w:t xml:space="preserve">32.292 ms</w:t>
+        <w:t xml:space="preserve">4.5 ms</w:t>
       </w:r>
     </w:p>
     <w:p>
@@ -2082,7 +2124,7 @@
         <w:rPr>
           <w:rStyle w:val="VerbatimChar"/>
         </w:rPr>
-        <w:t xml:space="preserve">462.598 ms</w:t>
+        <w:t xml:space="preserve">394.0 ms</w:t>
       </w:r>
     </w:p>
     <w:p>
@@ -2103,7 +2145,7 @@
         <w:rPr>
           <w:rStyle w:val="VerbatimChar"/>
         </w:rPr>
-        <w:t xml:space="preserve">485.266 ms</w:t>
+        <w:t xml:space="preserve">307.0 ms</w:t>
       </w:r>
     </w:p>
     <w:p>
@@ -2111,7 +2153,7 @@
         <w:pStyle w:val="FirstParagraph"/>
       </w:pPr>
       <w:r>
-        <w:t xml:space="preserve">This result is extremely strong. It shows that a simple stable lock-free table with linked-list buckets is better for reads than a more complicated dynamic-resizing design in this project.</w:t>
+        <w:t xml:space="preserve">This result is extremely strong. The two chaining-based lock-free designs are effectively tied at the top, but the fixed-size version remains slightly better and clearly simpler.</w:t>
       </w:r>
     </w:p>
     <w:p>
@@ -2129,14 +2171,14 @@
       <w:r>
         <w:drawing>
           <wp:inline>
-            <wp:extent cx="5334000" cy="3111500"/>
+            <wp:extent cx="5334000" cy="3556000"/>
             <wp:effectExtent b="0" l="0" r="0" t="0"/>
-            <wp:docPr descr="GET throughput at 262144 buckets" title="" id="47" name="Picture"/>
+            <wp:docPr descr="GET throughput at 131072 buckets" title="" id="47" name="Picture"/>
             <a:graphic>
               <a:graphicData uri="http://schemas.openxmlformats.org/drawingml/2006/picture">
                 <pic:pic>
                   <pic:nvPicPr>
-                    <pic:cNvPr descr="/Users/kvlnraju/College/courses/semester-4/multi-core/project/concurrent-hash-map/report/figures/get_262144.png" id="48" name="Picture"/>
+                    <pic:cNvPr descr="/Users/kvlnraju/College/courses/semester-4/multi-core/project/concurrent-hash-map/report/figures/get_131072_final.png" id="48" name="Picture"/>
                     <pic:cNvPicPr>
                       <a:picLocks noChangeArrowheads="1" noChangeAspect="1"/>
                     </pic:cNvPicPr>
@@ -2150,7 +2192,7 @@
                   <pic:spPr bwMode="auto">
                     <a:xfrm>
                       <a:off x="0" y="0"/>
-                      <a:ext cx="5334000" cy="3111500"/>
+                      <a:ext cx="5334000" cy="3556000"/>
                     </a:xfrm>
                     <a:prstGeom prst="rect">
                       <a:avLst/>
@@ -2174,7 +2216,7 @@
         <w:pStyle w:val="ImageCaption"/>
       </w:pPr>
       <w:r>
-        <w:t xml:space="preserve">GET throughput at 262144 buckets</w:t>
+        <w:t xml:space="preserve">GET throughput at 131072 buckets</w:t>
       </w:r>
     </w:p>
     <w:p>
@@ -2201,22 +2243,34 @@
         <w:t xml:space="preserve"> </w:t>
       </w:r>
       <w:r>
-        <w:t xml:space="preserve">throughput at</w:t>
-      </w:r>
-      <w:r>
-        <w:t xml:space="preserve"> </w:t>
-      </w:r>
-      <w:r>
-        <w:rPr>
-          <w:rStyle w:val="VerbatimChar"/>
-        </w:rPr>
-        <w:t xml:space="preserve">262144</w:t>
-      </w:r>
-      <w:r>
-        <w:t xml:space="preserve"> </w:t>
-      </w:r>
-      <w:r>
-        <w:t xml:space="preserve">buckets. The fixed-size lock-free chaining map gives the strongest and most consistent read throughput.</w:t>
+        <w:t xml:space="preserve">throughput in the final benchmark (</w:t>
+      </w:r>
+      <w:r>
+        <w:rPr>
+          <w:rStyle w:val="VerbatimChar"/>
+        </w:rPr>
+        <w:t xml:space="preserve">800000</w:t>
+      </w:r>
+      <w:r>
+        <w:t xml:space="preserve"> </w:t>
+      </w:r>
+      <w:r>
+        <w:t xml:space="preserve">operations,</w:t>
+      </w:r>
+      <w:r>
+        <w:t xml:space="preserve"> </w:t>
+      </w:r>
+      <w:r>
+        <w:rPr>
+          <w:rStyle w:val="VerbatimChar"/>
+        </w:rPr>
+        <w:t xml:space="preserve">131072</w:t>
+      </w:r>
+      <w:r>
+        <w:t xml:space="preserve"> </w:t>
+      </w:r>
+      <w:r>
+        <w:t xml:space="preserve">buckets). The fixed-size lock-free chaining map gives the strongest and most consistent read throughput.</w:t>
       </w:r>
     </w:p>
     <w:bookmarkEnd w:id="49"/>
@@ -2242,7 +2296,61 @@
         <w:pStyle w:val="BodyText"/>
       </w:pPr>
       <w:r>
-        <w:t xml:space="preserve">In the main sweep, the fixed-size lock-free chaining map is the best overall mixed-workload design, although the dynamic-resizing version stays close and wins some of the larger high-thread scenarios.</w:t>
+        <w:t xml:space="preserve">In the final benchmark, the fixed-size lock-free chaining map wins the mixed workload at</w:t>
+      </w:r>
+      <w:r>
+        <w:t xml:space="preserve"> </w:t>
+      </w:r>
+      <w:r>
+        <w:rPr>
+          <w:rStyle w:val="VerbatimChar"/>
+        </w:rPr>
+        <w:t xml:space="preserve">1</w:t>
+      </w:r>
+      <w:r>
+        <w:t xml:space="preserve">,</w:t>
+      </w:r>
+      <w:r>
+        <w:t xml:space="preserve"> </w:t>
+      </w:r>
+      <w:r>
+        <w:rPr>
+          <w:rStyle w:val="VerbatimChar"/>
+        </w:rPr>
+        <w:t xml:space="preserve">2</w:t>
+      </w:r>
+      <w:r>
+        <w:t xml:space="preserve">, and</w:t>
+      </w:r>
+      <w:r>
+        <w:t xml:space="preserve"> </w:t>
+      </w:r>
+      <w:r>
+        <w:rPr>
+          <w:rStyle w:val="VerbatimChar"/>
+        </w:rPr>
+        <w:t xml:space="preserve">8</w:t>
+      </w:r>
+      <w:r>
+        <w:t xml:space="preserve"> </w:t>
+      </w:r>
+      <w:r>
+        <w:t xml:space="preserve">threads, while the dynamic-resizing lock-free version wins slightly at</w:t>
+      </w:r>
+      <w:r>
+        <w:t xml:space="preserve"> </w:t>
+      </w:r>
+      <w:r>
+        <w:rPr>
+          <w:rStyle w:val="VerbatimChar"/>
+        </w:rPr>
+        <w:t xml:space="preserve">4</w:t>
+      </w:r>
+      <w:r>
+        <w:t xml:space="preserve"> </w:t>
+      </w:r>
+      <w:r>
+        <w:t xml:space="preserve">threads.</w:t>
       </w:r>
     </w:p>
     <w:p>
@@ -2259,7 +2367,7 @@
         <w:rPr>
           <w:rStyle w:val="VerbatimChar"/>
         </w:rPr>
-        <w:t xml:space="preserve">262144</w:t>
+        <w:t xml:space="preserve">131072</w:t>
       </w:r>
       <w:r>
         <w:t xml:space="preserve"> </w:t>
@@ -2274,7 +2382,7 @@
         <w:rPr>
           <w:rStyle w:val="VerbatimChar"/>
         </w:rPr>
-        <w:t xml:space="preserve">16</w:t>
+        <w:t xml:space="preserve">8</w:t>
       </w:r>
       <w:r>
         <w:t xml:space="preserve"> </w:t>
@@ -2301,7 +2409,7 @@
         <w:rPr>
           <w:rStyle w:val="VerbatimChar"/>
         </w:rPr>
-        <w:t xml:space="preserve">45.734 ms</w:t>
+        <w:t xml:space="preserve">74.1 ms</w:t>
       </w:r>
     </w:p>
     <w:p>
@@ -2322,7 +2430,7 @@
         <w:rPr>
           <w:rStyle w:val="VerbatimChar"/>
         </w:rPr>
-        <w:t xml:space="preserve">46.276 ms</w:t>
+        <w:t xml:space="preserve">110.1 ms</w:t>
       </w:r>
     </w:p>
     <w:p>
@@ -2343,7 +2451,7 @@
         <w:rPr>
           <w:rStyle w:val="VerbatimChar"/>
         </w:rPr>
-        <w:t xml:space="preserve">117.807 ms</w:t>
+        <w:t xml:space="preserve">425.4 ms</w:t>
       </w:r>
     </w:p>
     <w:p>
@@ -2364,7 +2472,7 @@
         <w:rPr>
           <w:rStyle w:val="VerbatimChar"/>
         </w:rPr>
-        <w:t xml:space="preserve">201.264 ms</w:t>
+        <w:t xml:space="preserve">535.0 ms</w:t>
       </w:r>
     </w:p>
     <w:p>
@@ -2372,7 +2480,57 @@
         <w:pStyle w:val="FirstParagraph"/>
       </w:pPr>
       <w:r>
-        <w:t xml:space="preserve">This is exactly the kind of result that supports a final design decision. The fixed-size lock-free design is not only good at one special case. It is the most balanced performer when reads and writes coexist.</w:t>
+        <w:t xml:space="preserve">At</w:t>
+      </w:r>
+      <w:r>
+        <w:t xml:space="preserve"> </w:t>
+      </w:r>
+      <w:r>
+        <w:rPr>
+          <w:rStyle w:val="VerbatimChar"/>
+        </w:rPr>
+        <w:t xml:space="preserve">4</w:t>
+      </w:r>
+      <w:r>
+        <w:t xml:space="preserve"> </w:t>
+      </w:r>
+      <w:r>
+        <w:t xml:space="preserve">threads, the dynamic-resizing version records</w:t>
+      </w:r>
+      <w:r>
+        <w:t xml:space="preserve"> </w:t>
+      </w:r>
+      <w:r>
+        <w:rPr>
+          <w:rStyle w:val="VerbatimChar"/>
+        </w:rPr>
+        <w:t xml:space="preserve">139.4 ms</w:t>
+      </w:r>
+      <w:r>
+        <w:t xml:space="preserve"> </w:t>
+      </w:r>
+      <w:r>
+        <w:t xml:space="preserve">while the fixed-size lock-free version records</w:t>
+      </w:r>
+      <w:r>
+        <w:t xml:space="preserve"> </w:t>
+      </w:r>
+      <w:r>
+        <w:rPr>
+          <w:rStyle w:val="VerbatimChar"/>
+        </w:rPr>
+        <w:t xml:space="preserve">145.6 ms</w:t>
+      </w:r>
+      <w:r>
+        <w:t xml:space="preserve">. That small crossover is useful: it shows that the dynamic-resizing version can still help under some mixed conditions, but it does not overturn the overall result.</w:t>
+      </w:r>
+    </w:p>
+    <w:p>
+      <w:pPr>
+        <w:pStyle w:val="BodyText"/>
+      </w:pPr>
+      <w:r>
+        <w:t xml:space="preserve">This is exactly the kind of result that supports a final design decision. The fixed-size lock-free design is not only good at one special case. It is the most balanced performer when reads and writes coexist, while the dynamic-resizing version remains a credible extension rather than the best default choice.</w:t>
       </w:r>
     </w:p>
     <w:p>
@@ -2382,14 +2540,14 @@
       <w:r>
         <w:drawing>
           <wp:inline>
-            <wp:extent cx="5334000" cy="3111500"/>
+            <wp:extent cx="5334000" cy="3556000"/>
             <wp:effectExtent b="0" l="0" r="0" t="0"/>
-            <wp:docPr descr="MIXED throughput at 262144 buckets" title="" id="51" name="Picture"/>
+            <wp:docPr descr="MIXED throughput at 131072 buckets" title="" id="51" name="Picture"/>
             <a:graphic>
               <a:graphicData uri="http://schemas.openxmlformats.org/drawingml/2006/picture">
                 <pic:pic>
                   <pic:nvPicPr>
-                    <pic:cNvPr descr="/Users/kvlnraju/College/courses/semester-4/multi-core/project/concurrent-hash-map/report/figures/mixed_262144.png" id="52" name="Picture"/>
+                    <pic:cNvPr descr="/Users/kvlnraju/College/courses/semester-4/multi-core/project/concurrent-hash-map/report/figures/mixed_131072_final.png" id="52" name="Picture"/>
                     <pic:cNvPicPr>
                       <a:picLocks noChangeArrowheads="1" noChangeAspect="1"/>
                     </pic:cNvPicPr>
@@ -2403,7 +2561,7 @@
                   <pic:spPr bwMode="auto">
                     <a:xfrm>
                       <a:off x="0" y="0"/>
-                      <a:ext cx="5334000" cy="3111500"/>
+                      <a:ext cx="5334000" cy="3556000"/>
                     </a:xfrm>
                     <a:prstGeom prst="rect">
                       <a:avLst/>
@@ -2427,7 +2585,7 @@
         <w:pStyle w:val="ImageCaption"/>
       </w:pPr>
       <w:r>
-        <w:t xml:space="preserve">MIXED throughput at 262144 buckets</w:t>
+        <w:t xml:space="preserve">MIXED throughput at 131072 buckets</w:t>
       </w:r>
     </w:p>
     <w:p>
@@ -2454,22 +2612,34 @@
         <w:t xml:space="preserve"> </w:t>
       </w:r>
       <w:r>
-        <w:t xml:space="preserve">throughput at</w:t>
-      </w:r>
-      <w:r>
-        <w:t xml:space="preserve"> </w:t>
-      </w:r>
-      <w:r>
-        <w:rPr>
-          <w:rStyle w:val="VerbatimChar"/>
-        </w:rPr>
-        <w:t xml:space="preserve">262144</w:t>
-      </w:r>
-      <w:r>
-        <w:t xml:space="preserve"> </w:t>
-      </w:r>
-      <w:r>
-        <w:t xml:space="preserve">buckets. The fixed-size lock-free chaining map is the strongest all-around design in the full benchmark sweep.</w:t>
+        <w:t xml:space="preserve">throughput in the final benchmark (</w:t>
+      </w:r>
+      <w:r>
+        <w:rPr>
+          <w:rStyle w:val="VerbatimChar"/>
+        </w:rPr>
+        <w:t xml:space="preserve">800000</w:t>
+      </w:r>
+      <w:r>
+        <w:t xml:space="preserve"> </w:t>
+      </w:r>
+      <w:r>
+        <w:t xml:space="preserve">operations,</w:t>
+      </w:r>
+      <w:r>
+        <w:t xml:space="preserve"> </w:t>
+      </w:r>
+      <w:r>
+        <w:rPr>
+          <w:rStyle w:val="VerbatimChar"/>
+        </w:rPr>
+        <w:t xml:space="preserve">131072</w:t>
+      </w:r>
+      <w:r>
+        <w:t xml:space="preserve"> </w:t>
+      </w:r>
+      <w:r>
+        <w:t xml:space="preserve">buckets). The fixed-size lock-free chaining map is the strongest all-around design, with the dynamic-resizing version winning one mid-range point.</w:t>
       </w:r>
     </w:p>
     <w:bookmarkEnd w:id="53"/>

</xml_diff>